<commit_message>
chore: ramos develop/master, guia enunciado Fase 3, deploy K8s por branch; links entrega em master
</commit_message>
<xml_diff>
--- a/docs/fase3/entrega-portal-fase3.docx
+++ b/docs/fase3/entrega-portal-fase3.docx
@@ -506,6 +506,18 @@
         <w:rPr>
           <w:rStyle w:val="VerbatimChar"/>
         </w:rPr>
+        <w:t xml:space="preserve">master</w:t>
+      </w:r>
+      <w:r>
+        <w:t xml:space="preserve">; integração em</w:t>
+      </w:r>
+      <w:r>
+        <w:t xml:space="preserve"> </w:t>
+      </w:r>
+      <w:r>
+        <w:rPr>
+          <w:rStyle w:val="VerbatimChar"/>
+        </w:rPr>
         <w:t xml:space="preserve">develop</w:t>
       </w:r>
       <w:r>
@@ -875,7 +887,7 @@
               <w:rPr>
                 <w:rStyle w:val="VerbatimChar"/>
               </w:rPr>
-              <w:t xml:space="preserve">https://github.com/ricartefelipe/oficina-springboot-mvp/tree/develop/docs/fase3</w:t>
+              <w:t xml:space="preserve">https://github.com/ricartefelipe/oficina-springboot-mvp/tree/master/docs/fase3</w:t>
             </w:r>
           </w:p>
         </w:tc>
@@ -902,7 +914,7 @@
               <w:rPr>
                 <w:rStyle w:val="VerbatimChar"/>
               </w:rPr>
-              <w:t xml:space="preserve">https://github.com/ricartefelipe/oficina-springboot-mvp/tree/develop/docs/adr</w:t>
+              <w:t xml:space="preserve">https://github.com/ricartefelipe/oficina-springboot-mvp/tree/master/docs/adr</w:t>
             </w:r>
           </w:p>
         </w:tc>
@@ -929,7 +941,7 @@
               <w:rPr>
                 <w:rStyle w:val="VerbatimChar"/>
               </w:rPr>
-              <w:t xml:space="preserve">https://github.com/ricartefelipe/oficina-springboot-mvp/blob/develop/docs/fase3/rfc/rfc-0001-autenticacao-cpf-jwt-serverless.md</w:t>
+              <w:t xml:space="preserve">https://github.com/ricartefelipe/oficina-springboot-mvp/blob/master/docs/fase3/rfc/rfc-0001-autenticacao-cpf-jwt-serverless.md</w:t>
             </w:r>
           </w:p>
         </w:tc>
@@ -956,7 +968,7 @@
               <w:rPr>
                 <w:rStyle w:val="VerbatimChar"/>
               </w:rPr>
-              <w:t xml:space="preserve">https://github.com/ricartefelipe/oficina-springboot-mvp/blob/develop/docs/development/architecture-standards.md</w:t>
+              <w:t xml:space="preserve">https://github.com/ricartefelipe/oficina-springboot-mvp/blob/master/docs/development/architecture-standards.md</w:t>
             </w:r>
           </w:p>
         </w:tc>
@@ -983,7 +995,7 @@
               <w:rPr>
                 <w:rStyle w:val="VerbatimChar"/>
               </w:rPr>
-              <w:t xml:space="preserve">https://github.com/ricartefelipe/oficina-springboot-mvp/blob/develop/docs/fase3/TERMINAR-FASE3.md</w:t>
+              <w:t xml:space="preserve">https://github.com/ricartefelipe/oficina-springboot-mvp/blob/master/docs/fase3/TERMINAR-FASE3.md</w:t>
             </w:r>
           </w:p>
         </w:tc>
@@ -1010,7 +1022,7 @@
               <w:rPr>
                 <w:rStyle w:val="VerbatimChar"/>
               </w:rPr>
-              <w:t xml:space="preserve">https://github.com/ricartefelipe/oficina-springboot-mvp/blob/develop/docs/fase3/terraform-snippet-api-gateway.tf</w:t>
+              <w:t xml:space="preserve">https://github.com/ricartefelipe/oficina-springboot-mvp/blob/master/docs/fase3/terraform-snippet-api-gateway.tf</w:t>
             </w:r>
           </w:p>
         </w:tc>
@@ -2146,13 +2158,7 @@
           <w:b/>
           <w:bCs/>
         </w:rPr>
-        <w:t xml:space="preserve">Forma mais rápida:</w:t>
-      </w:r>
-      <w:r>
-        <w:t xml:space="preserve"> </w:t>
-      </w:r>
-      <w:r>
-        <w:t xml:space="preserve">no repositório existe</w:t>
+        <w:t xml:space="preserve">Já existe no repositório:</w:t>
       </w:r>
       <w:r>
         <w:t xml:space="preserve"> </w:t>
@@ -2163,13 +2169,13 @@
           <w:b/>
           <w:bCs/>
         </w:rPr>
-        <w:t xml:space="preserve">entrega-portal-fase3.docx</w:t>
-      </w:r>
-      <w:r>
-        <w:t xml:space="preserve"> </w:t>
-      </w:r>
-      <w:r>
-        <w:t xml:space="preserve">(gerado a partir deste</w:t>
+        <w:t xml:space="preserve">entrega-portal-fase3.pdf</w:t>
+      </w:r>
+      <w:r>
+        <w:t xml:space="preserve"> </w:t>
+      </w:r>
+      <w:r>
+        <w:t xml:space="preserve">na mesma pasta que este ficheiro — podes fazer download direto e submeter no portal (preenche nome/turma no PDF com um editor de PDF ou regenera após editar o</w:t>
       </w:r>
       <w:r>
         <w:t xml:space="preserve"> </w:t>
@@ -2179,35 +2185,6 @@
           <w:rStyle w:val="VerbatimChar"/>
         </w:rPr>
         <w:t xml:space="preserve">.md</w:t>
-      </w:r>
-      <w:r>
-        <w:t xml:space="preserve">). Abre no Word →</w:t>
-      </w:r>
-      <w:r>
-        <w:t xml:space="preserve"> </w:t>
-      </w:r>
-      <w:r>
-        <w:rPr>
-          <w:b/>
-          <w:bCs/>
-        </w:rPr>
-        <w:t xml:space="preserve">Ficheiro → Guardar como → PDF</w:t>
-      </w:r>
-      <w:r>
-        <w:t xml:space="preserve"> </w:t>
-      </w:r>
-      <w:r>
-        <w:t xml:space="preserve">(ou</w:t>
-      </w:r>
-      <w:r>
-        <w:t xml:space="preserve"> </w:t>
-      </w:r>
-      <w:r>
-        <w:rPr>
-          <w:b/>
-          <w:bCs/>
-        </w:rPr>
-        <w:t xml:space="preserve">Imprimir → Microsoft Print to PDF</w:t>
       </w:r>
       <w:r>
         <w:t xml:space="preserve">).</w:t>
@@ -2226,13 +2203,7 @@
           <w:b/>
           <w:bCs/>
         </w:rPr>
-        <w:t xml:space="preserve">A partir do Markdown:</w:t>
-      </w:r>
-      <w:r>
-        <w:t xml:space="preserve"> </w:t>
-      </w:r>
-      <w:r>
-        <w:t xml:space="preserve">abre</w:t>
+        <w:t xml:space="preserve">Alternativa Word:</w:t>
       </w:r>
       <w:r>
         <w:t xml:space="preserve"> </w:t>
@@ -2240,30 +2211,16 @@
       <w:r>
         <w:rPr>
           <w:rStyle w:val="VerbatimChar"/>
-        </w:rPr>
-        <w:t xml:space="preserve">entrega-portal-fase3.md</w:t>
-      </w:r>
-      <w:r>
-        <w:t xml:space="preserve"> </w:t>
-      </w:r>
-      <w:r>
-        <w:t xml:space="preserve">no GitHub ou no editor,</w:t>
-      </w:r>
-      <w:r>
-        <w:t xml:space="preserve"> </w:t>
-      </w:r>
-      <w:r>
-        <w:rPr>
-          <w:b/>
-          <w:bCs/>
-        </w:rPr>
-        <w:t xml:space="preserve">preenche</w:t>
-      </w:r>
-      <w:r>
-        <w:t xml:space="preserve"> </w:t>
-      </w:r>
-      <w:r>
-        <w:t xml:space="preserve">nome e turma na secção 1, depois cola no Word/Google Docs e exporta PDF.</w:t>
+          <w:b/>
+          <w:bCs/>
+        </w:rPr>
+        <w:t xml:space="preserve">entrega-portal-fase3.docx</w:t>
+      </w:r>
+      <w:r>
+        <w:t xml:space="preserve"> </w:t>
+      </w:r>
+      <w:r>
+        <w:t xml:space="preserve">→ Guardar como PDF.</w:t>
       </w:r>
     </w:p>
     <w:p>
@@ -2279,13 +2236,36 @@
           <w:b/>
           <w:bCs/>
         </w:rPr>
-        <w:t xml:space="preserve">Pandoc para PDF</w:t>
-      </w:r>
-      <w:r>
-        <w:t xml:space="preserve"> </w:t>
-      </w:r>
-      <w:r>
-        <w:t xml:space="preserve">(requer motor PDF, ex. MiKTeX/pdflatex):</w:t>
+        <w:t xml:space="preserve">Regenerar o PDF a partir deste</w:t>
+      </w:r>
+      <w:r>
+        <w:rPr>
+          <w:b/>
+          <w:bCs/>
+        </w:rPr>
+        <w:t xml:space="preserve"> </w:t>
+      </w:r>
+      <w:r>
+        <w:rPr>
+          <w:rStyle w:val="VerbatimChar"/>
+          <w:b/>
+          <w:bCs/>
+        </w:rPr>
+        <w:t xml:space="preserve">.md</w:t>
+      </w:r>
+      <w:r>
+        <w:rPr>
+          <w:b/>
+          <w:bCs/>
+        </w:rPr>
+        <w:t xml:space="preserve"> </w:t>
+      </w:r>
+      <w:r>
+        <w:rPr>
+          <w:b/>
+          <w:bCs/>
+        </w:rPr>
+        <w:t xml:space="preserve">(Windows, Edge):</w:t>
       </w:r>
       <w:r>
         <w:br/>
@@ -2294,7 +2274,22 @@
         <w:rPr>
           <w:rStyle w:val="VerbatimChar"/>
         </w:rPr>
-        <w:t xml:space="preserve">pandoc entrega-portal-fase3.md -o entrega-portal-fase3.pdf</w:t>
+        <w:t xml:space="preserve">pandoc entrega-portal-fase3.md -o _tmp.html --standalone</w:t>
+      </w:r>
+      <w:r>
+        <w:br/>
+      </w:r>
+      <w:r>
+        <w:t xml:space="preserve">depois Edge em modo headless:</w:t>
+      </w:r>
+      <w:r>
+        <w:br/>
+      </w:r>
+      <w:r>
+        <w:rPr>
+          <w:rStyle w:val="VerbatimChar"/>
+        </w:rPr>
+        <w:t xml:space="preserve">"C:\Program Files (x86)\Microsoft\Edge\Application\msedge.exe" --headless --disable-gpu --print-to-pdf=entrega-portal-fase3.pdf file:///C:/caminho/completo/_tmp.html</w:t>
       </w:r>
     </w:p>
     <w:p>

</xml_diff>